<commit_message>
Roteiro Roberto Müller: revisão da parte 2
Co-Authored-By: Claude Opus 5.5 <noreply@anthropic.com>
Claude-Session: https://claude.ai/code/session_01MJjUEEZrxQDEUifKK2vj9g
</commit_message>
<xml_diff>
--- a/roteiros/roberto-muller/RobertoMuller_Parte2.docx
+++ b/roteiros/roberto-muller/RobertoMuller_Parte2.docx
@@ -31,7 +31,7 @@
         <w:rPr>
           <w:color w:val="000000"/>
         </w:rPr>
-        <w:t>Nos anos sessenta, Chacrinha comandava um dos programas mais assistidos da televisão brasileira, a "Discoteca do Chacrinha", na TV Tupi. Buzina na mão e bacalhau voando para a plateia. Aparecer ali significava ser visto por milhões de pessoas de uma vez.</w:t>
+        <w:t>Chacrinha comandava um dos programas mais assistidos da televisão brasileira, a "Discoteca do Chacrinha". Buzina na mão e bacalhau voando para a plateia. Aparecer ali significava ser visto por milhões de pessoas de uma vez.</w:t>
       </w:r>
     </w:p>
     <w:p>
@@ -143,7 +143,7 @@
         <w:rPr>
           <w:color w:val="000000"/>
         </w:rPr>
-        <w:t>Os seis discos de ouro vieram nessa época.</w:t>
+        <w:t>Ao longo dessa trajetória vieram os seis discos de ouro.</w:t>
       </w:r>
     </w:p>
     <w:p>
@@ -183,7 +183,7 @@
         <w:rPr>
           <w:color w:val="000000"/>
         </w:rPr>
-        <w:t>O Nordeste era o lugar onde o público dele era mais fiel. Onde as rádios nunca pararam de tocar as músicas dele. Onde, em cada cidade do interior, havia uma festa esperando pelo Pingo de Ouro.</w:t>
+        <w:t>O Nordeste era onde o público dele era mais fiel, e onde as rádios continuavam tocando as músicas do Pingo de Ouro.</w:t>
       </w:r>
     </w:p>
     <w:p>
@@ -207,7 +207,7 @@
         <w:rPr>
           <w:color w:val="000000"/>
         </w:rPr>
-        <w:t>E foi lá também que esteve ao lado dele a mulher que seria a companheira dos anos mais difíceis. Dagmar Pereira, compositora e empresária.</w:t>
+        <w:t>No Recife, ao lado dele, estava a mulher que seria a companheira dos anos mais difíceis. Dagmar Pereira, compositora e empresária.</w:t>
       </w:r>
     </w:p>
     <w:p>
@@ -247,7 +247,7 @@
         <w:rPr>
           <w:color w:val="C00000"/>
         </w:rPr>
-        <w:t>E aqui entra o segundo objeto dessa história. Um livro. Um livro escolar, feito pelo governo para ensinar crianças. Pense no que significa uma criança abrir um livro na escola e aprender uma mentira sobre você. Agora pense que essa mentira é a sua própria morte.</w:t>
+        <w:t>O segundo objeto dessa história é um livro. Um livro escolar, feito pelo governo para ensinar crianças. E dentro dele estava impressa a maior mentira que se pode contar sobre um homem vivo.</w:t>
       </w:r>
     </w:p>
     <w:p>
@@ -407,7 +407,7 @@
         <w:rPr>
           <w:color w:val="000000"/>
         </w:rPr>
-        <w:t>Mas aquele erro revelava uma coisa que Roberto talvez já sentisse e não quisesse admitir. O tempo dele estava passando. O Brasil estava mudando. As rádios estavam trocando os boleros por outros ritmos. E o nome que antes lotava auditórios começava a aparecer no passado.</w:t>
+        <w:t>Mas aquele erro revelava uma coisa que Roberto talvez já sentisse e não quisesse admitir. O tempo dele estava passando, e as rádios começavam a trocar os boleros por outros ritmos. O nome que antes lotava auditórios começava a aparecer no passado.</w:t>
       </w:r>
     </w:p>
     <w:p>

</xml_diff>